<commit_message>
IHK-Antwort eingearbeitet: Tragfaehigkeitsbescheinigung entfaellt
Die IHK Frankfurt am Main stellt keine Tragfaehigkeitsbescheinigung aus; das
Jobcenter prueft den Antrag selbst. Der Schritt entfaellt damit im Startplan.
Businessplan-Durchsicht ist kostenlos und laeuft vorab per Mail, Seminar
Grundlagen der Existenzgruendung am 07.10.2026.

- Businessplan: Kopfdaten ausgefuellt (Beginn, Stand); zweite Fassung ohne
  Jobcenter-Kundennummer fuer die IHK (node baue_businessplan.js ihk)
- extrahiere_bp.py ergaenzt, damit die PDF-Fassung reproduzierbar aus der
  Word-Datei entsteht statt aus einem Zwischenstand
- Startplan Schritt 2 neu geschrieben und PDF neu erzeugt

Co-Authored-By: Claude Opus 5 <noreply@anthropic.com>
Claude-Session: https://claude.ai/code/session_01ECQV3LX17FPwV9aCb3VGtx
</commit_message>
<xml_diff>
--- a/erechnung/jobcenter/Businessplan-E-Rechnung.docx
+++ b/erechnung/jobcenter/Businessplan-E-Rechnung.docx
@@ -113,58 +113,20 @@
           <w:sz w:val="21"/>
           <w:szCs w:val="21"/>
         </w:rPr>
-        <w:t xml:space="preserve">Geplanter Beginn der Tätigkeit: </w:t>
-      </w:r>
-      <w:r>
-        <w:rPr>
-          <w:rFonts w:ascii="Arial" w:cs="Arial" w:eastAsia="Arial" w:hAnsi="Arial"/>
-          <w:b/>
-          <w:bCs/>
-          <w:color w:val="A93C1B"/>
+        <w:t xml:space="preserve">Geplanter Beginn der Tätigkeit: nach Bewilligung des Einstiegsgelds, voraussichtlich viertes Quartal 2026</w:t>
+      </w:r>
+    </w:p>
+    <w:p>
+      <w:pPr>
+        <w:spacing w:after="120" w:line="276"/>
+      </w:pPr>
+      <w:r>
+        <w:rPr>
+          <w:rFonts w:ascii="Arial" w:cs="Arial" w:eastAsia="Arial" w:hAnsi="Arial"/>
           <w:sz w:val="21"/>
           <w:szCs w:val="21"/>
         </w:rPr>
-        <w:t xml:space="preserve">[Monat / Jahr]</w:t>
-      </w:r>
-      <w:r>
-        <w:rPr>
-          <w:rFonts w:ascii="Arial" w:cs="Arial" w:eastAsia="Arial" w:hAnsi="Arial"/>
-          <w:sz w:val="21"/>
-          <w:szCs w:val="21"/>
-        </w:rPr>
-        <w:t xml:space="preserve"/>
-      </w:r>
-    </w:p>
-    <w:p>
-      <w:pPr>
-        <w:spacing w:after="120" w:line="276"/>
-      </w:pPr>
-      <w:r>
-        <w:rPr>
-          <w:rFonts w:ascii="Arial" w:cs="Arial" w:eastAsia="Arial" w:hAnsi="Arial"/>
-          <w:sz w:val="21"/>
-          <w:szCs w:val="21"/>
-        </w:rPr>
-        <w:t xml:space="preserve">Stand: </w:t>
-      </w:r>
-      <w:r>
-        <w:rPr>
-          <w:rFonts w:ascii="Arial" w:cs="Arial" w:eastAsia="Arial" w:hAnsi="Arial"/>
-          <w:b/>
-          <w:bCs/>
-          <w:color w:val="A93C1B"/>
-          <w:sz w:val="21"/>
-          <w:szCs w:val="21"/>
-        </w:rPr>
-        <w:t xml:space="preserve">[Datum]</w:t>
-      </w:r>
-      <w:r>
-        <w:rPr>
-          <w:rFonts w:ascii="Arial" w:cs="Arial" w:eastAsia="Arial" w:hAnsi="Arial"/>
-          <w:sz w:val="21"/>
-          <w:szCs w:val="21"/>
-        </w:rPr>
-        <w:t xml:space="preserve"/>
+        <w:t xml:space="preserve">Stand: September 2026</w:t>
       </w:r>
     </w:p>
     <w:p>

</xml_diff>